<commit_message>
noted down all the business questions that the database must answer
</commit_message>
<xml_diff>
--- a/docs_and_notes/business_questions.docx
+++ b/docs_and_notes/business_questions.docx
@@ -45,6 +45,9 @@
       </w:pPr>
       <w:r>
         <w:t>How many items are in an order?</w:t>
+      </w:r>
+      <w:r>
+        <w:t xml:space="preserve"> </w:t>
       </w:r>
     </w:p>
     <w:p>
@@ -819,25 +822,7 @@
           <w:szCs w:val="32"/>
         </w:rPr>
         <w:lastRenderedPageBreak/>
-        <w:t xml:space="preserve">App/Customer Behaviour </w:t>
-      </w:r>
-      <w:r>
-        <w:rPr>
-          <w:b/>
-          <w:bCs/>
-          <w:sz w:val="26"/>
-          <w:szCs w:val="32"/>
-        </w:rPr>
-        <w:t>-</w:t>
-      </w:r>
-      <w:r>
-        <w:rPr>
-          <w:b/>
-          <w:bCs/>
-          <w:sz w:val="26"/>
-          <w:szCs w:val="32"/>
-        </w:rPr>
-        <w:t xml:space="preserve"> Complete Question Set</w:t>
+        <w:t>App/Customer Behaviour - Complete Question Set</w:t>
       </w:r>
     </w:p>
     <w:p>

</xml_diff>